<commit_message>
Add hyperlinks for Visual Studio Code tutorials in poznamky_k_hodinam.docx
</commit_message>
<xml_diff>
--- a/Poznamky/poznamky_k_hodinam.docx
+++ b/Poznamky/poznamky_k_hodinam.docx
@@ -41,9 +41,11 @@
       <w:pPr>
         <w:pStyle w:val="Heading2"/>
       </w:pPr>
+      <w:proofErr w:type="spellStart"/>
       <w:r>
         <w:t>Elements</w:t>
       </w:r>
+      <w:proofErr w:type="spellEnd"/>
     </w:p>
     <w:p>
       <w:r>
@@ -62,12 +64,56 @@
           <w:lang w:val="en-US"/>
         </w:rPr>
       </w:pPr>
-      <w:r>
-        <w:rPr>
-          <w:lang w:val="en-US"/>
-        </w:rPr>
-        <w:t>Prvky na úrovni blokov</w:t>
-      </w:r>
+      <w:proofErr w:type="spellStart"/>
+      <w:r>
+        <w:rPr>
+          <w:lang w:val="en-US"/>
+        </w:rPr>
+        <w:t>Prvky</w:t>
+      </w:r>
+      <w:proofErr w:type="spellEnd"/>
+      <w:r>
+        <w:rPr>
+          <w:lang w:val="en-US"/>
+        </w:rPr>
+        <w:t xml:space="preserve"> </w:t>
+      </w:r>
+      <w:proofErr w:type="spellStart"/>
+      <w:r>
+        <w:rPr>
+          <w:lang w:val="en-US"/>
+        </w:rPr>
+        <w:t>na</w:t>
+      </w:r>
+      <w:proofErr w:type="spellEnd"/>
+      <w:r>
+        <w:rPr>
+          <w:lang w:val="en-US"/>
+        </w:rPr>
+        <w:t xml:space="preserve"> </w:t>
+      </w:r>
+      <w:proofErr w:type="spellStart"/>
+      <w:r>
+        <w:rPr>
+          <w:lang w:val="en-US"/>
+        </w:rPr>
+        <w:t>úrovni</w:t>
+      </w:r>
+      <w:proofErr w:type="spellEnd"/>
+      <w:r>
+        <w:rPr>
+          <w:lang w:val="en-US"/>
+        </w:rPr>
+        <w:t xml:space="preserve"> </w:t>
+      </w:r>
+      <w:proofErr w:type="spellStart"/>
+      <w:r>
+        <w:rPr>
+          <w:lang w:val="en-US"/>
+        </w:rPr>
+        <w:t>blokov</w:t>
+      </w:r>
+      <w:proofErr w:type="spellEnd"/>
     </w:p>
     <w:p>
       <w:pPr>
@@ -91,7 +137,63 @@
         <w:rPr>
           <w:lang w:val="en-US"/>
         </w:rPr>
-        <w:t> Univerzálny kontajner pre iné prvky.</w:t>
+        <w:t> </w:t>
+      </w:r>
+      <w:proofErr w:type="spellStart"/>
+      <w:r>
+        <w:rPr>
+          <w:lang w:val="en-US"/>
+        </w:rPr>
+        <w:t>Univerzálny</w:t>
+      </w:r>
+      <w:proofErr w:type="spellEnd"/>
+      <w:r>
+        <w:rPr>
+          <w:lang w:val="en-US"/>
+        </w:rPr>
+        <w:t xml:space="preserve"> </w:t>
+      </w:r>
+      <w:proofErr w:type="spellStart"/>
+      <w:r>
+        <w:rPr>
+          <w:lang w:val="en-US"/>
+        </w:rPr>
+        <w:t>kontajner</w:t>
+      </w:r>
+      <w:proofErr w:type="spellEnd"/>
+      <w:r>
+        <w:rPr>
+          <w:lang w:val="en-US"/>
+        </w:rPr>
+        <w:t xml:space="preserve"> pre </w:t>
+      </w:r>
+      <w:proofErr w:type="spellStart"/>
+      <w:r>
+        <w:rPr>
+          <w:lang w:val="en-US"/>
+        </w:rPr>
+        <w:t>iné</w:t>
+      </w:r>
+      <w:proofErr w:type="spellEnd"/>
+      <w:r>
+        <w:rPr>
+          <w:lang w:val="en-US"/>
+        </w:rPr>
+        <w:t xml:space="preserve"> </w:t>
+      </w:r>
+      <w:proofErr w:type="spellStart"/>
+      <w:r>
+        <w:rPr>
+          <w:lang w:val="en-US"/>
+        </w:rPr>
+        <w:t>prvky</w:t>
+      </w:r>
+      <w:proofErr w:type="spellEnd"/>
+      <w:r>
+        <w:rPr>
+          <w:lang w:val="en-US"/>
+        </w:rPr>
+        <w:t>.</w:t>
       </w:r>
     </w:p>
     <w:p>
@@ -116,7 +218,35 @@
         <w:rPr>
           <w:lang w:val="en-US"/>
         </w:rPr>
-        <w:t> Definuje odsek.</w:t>
+        <w:t> </w:t>
+      </w:r>
+      <w:proofErr w:type="spellStart"/>
+      <w:r>
+        <w:rPr>
+          <w:lang w:val="en-US"/>
+        </w:rPr>
+        <w:t>Definuje</w:t>
+      </w:r>
+      <w:proofErr w:type="spellEnd"/>
+      <w:r>
+        <w:rPr>
+          <w:lang w:val="en-US"/>
+        </w:rPr>
+        <w:t xml:space="preserve"> </w:t>
+      </w:r>
+      <w:proofErr w:type="spellStart"/>
+      <w:r>
+        <w:rPr>
+          <w:lang w:val="en-US"/>
+        </w:rPr>
+        <w:t>odsek</w:t>
+      </w:r>
+      <w:proofErr w:type="spellEnd"/>
+      <w:r>
+        <w:rPr>
+          <w:lang w:val="en-US"/>
+        </w:rPr>
+        <w:t>.</w:t>
       </w:r>
     </w:p>
     <w:p>
@@ -141,7 +271,49 @@
         <w:rPr>
           <w:lang w:val="en-US"/>
         </w:rPr>
-        <w:t> Nadpisy rôznych úrovní.</w:t>
+        <w:t> </w:t>
+      </w:r>
+      <w:proofErr w:type="spellStart"/>
+      <w:r>
+        <w:rPr>
+          <w:lang w:val="en-US"/>
+        </w:rPr>
+        <w:t>Nadpisy</w:t>
+      </w:r>
+      <w:proofErr w:type="spellEnd"/>
+      <w:r>
+        <w:rPr>
+          <w:lang w:val="en-US"/>
+        </w:rPr>
+        <w:t xml:space="preserve"> </w:t>
+      </w:r>
+      <w:proofErr w:type="spellStart"/>
+      <w:r>
+        <w:rPr>
+          <w:lang w:val="en-US"/>
+        </w:rPr>
+        <w:t>rôznych</w:t>
+      </w:r>
+      <w:proofErr w:type="spellEnd"/>
+      <w:r>
+        <w:rPr>
+          <w:lang w:val="en-US"/>
+        </w:rPr>
+        <w:t xml:space="preserve"> </w:t>
+      </w:r>
+      <w:proofErr w:type="spellStart"/>
+      <w:r>
+        <w:rPr>
+          <w:lang w:val="en-US"/>
+        </w:rPr>
+        <w:t>úrovní</w:t>
+      </w:r>
+      <w:proofErr w:type="spellEnd"/>
+      <w:r>
+        <w:rPr>
+          <w:lang w:val="en-US"/>
+        </w:rPr>
+        <w:t>.</w:t>
       </w:r>
     </w:p>
     <w:p>
@@ -160,13 +332,73 @@
           <w:bCs/>
           <w:lang w:val="en-US"/>
         </w:rPr>
-        <w:t>&lt;ol&gt;, &lt;ul&gt;:</w:t>
-      </w:r>
-      <w:r>
-        <w:rPr>
-          <w:lang w:val="en-US"/>
-        </w:rPr>
-        <w:t> Usporiadané a neusporiadané zoznamy.</w:t>
+        <w:t>&lt;</w:t>
+      </w:r>
+      <w:proofErr w:type="spellStart"/>
+      <w:r>
+        <w:rPr>
+          <w:b/>
+          <w:bCs/>
+          <w:lang w:val="en-US"/>
+        </w:rPr>
+        <w:t>ol</w:t>
+      </w:r>
+      <w:proofErr w:type="spellEnd"/>
+      <w:r>
+        <w:rPr>
+          <w:b/>
+          <w:bCs/>
+          <w:lang w:val="en-US"/>
+        </w:rPr>
+        <w:t>&gt;, &lt;ul&gt;:</w:t>
+      </w:r>
+      <w:r>
+        <w:rPr>
+          <w:lang w:val="en-US"/>
+        </w:rPr>
+        <w:t> </w:t>
+      </w:r>
+      <w:proofErr w:type="spellStart"/>
+      <w:r>
+        <w:rPr>
+          <w:lang w:val="en-US"/>
+        </w:rPr>
+        <w:t>Usporiadané</w:t>
+      </w:r>
+      <w:proofErr w:type="spellEnd"/>
+      <w:r>
+        <w:rPr>
+          <w:lang w:val="en-US"/>
+        </w:rPr>
+        <w:t xml:space="preserve"> a </w:t>
+      </w:r>
+      <w:proofErr w:type="spellStart"/>
+      <w:r>
+        <w:rPr>
+          <w:lang w:val="en-US"/>
+        </w:rPr>
+        <w:t>neusporiadané</w:t>
+      </w:r>
+      <w:proofErr w:type="spellEnd"/>
+      <w:r>
+        <w:rPr>
+          <w:lang w:val="en-US"/>
+        </w:rPr>
+        <w:t xml:space="preserve"> </w:t>
+      </w:r>
+      <w:proofErr w:type="spellStart"/>
+      <w:r>
+        <w:rPr>
+          <w:lang w:val="en-US"/>
+        </w:rPr>
+        <w:t>zoznamy</w:t>
+      </w:r>
+      <w:proofErr w:type="spellEnd"/>
+      <w:r>
+        <w:rPr>
+          <w:lang w:val="en-US"/>
+        </w:rPr>
+        <w:t>.</w:t>
       </w:r>
     </w:p>
     <w:p>
@@ -195,11 +427,33 @@
         </w:rPr>
         <w:t xml:space="preserve"> </w:t>
       </w:r>
-      <w:r>
-        <w:rPr>
-          <w:lang w:val="en-US"/>
-        </w:rPr>
-        <w:t>Definuje tabuľku.</w:t>
+      <w:proofErr w:type="spellStart"/>
+      <w:r>
+        <w:rPr>
+          <w:lang w:val="en-US"/>
+        </w:rPr>
+        <w:t>Definuje</w:t>
+      </w:r>
+      <w:proofErr w:type="spellEnd"/>
+      <w:r>
+        <w:rPr>
+          <w:lang w:val="en-US"/>
+        </w:rPr>
+        <w:t xml:space="preserve"> </w:t>
+      </w:r>
+      <w:proofErr w:type="spellStart"/>
+      <w:r>
+        <w:rPr>
+          <w:lang w:val="en-US"/>
+        </w:rPr>
+        <w:t>tabuľku</w:t>
+      </w:r>
+      <w:proofErr w:type="spellEnd"/>
+      <w:r>
+        <w:rPr>
+          <w:lang w:val="en-US"/>
+        </w:rPr>
+        <w:t>.</w:t>
       </w:r>
     </w:p>
     <w:p>
@@ -216,7 +470,119 @@
         <w:rPr>
           <w:lang w:val="en-US"/>
         </w:rPr>
-        <w:t>&lt;form&gt;: Používa sa na HTML formuláre na zber vstupov používateľa.</w:t>
+        <w:t xml:space="preserve">&lt;form&gt;: </w:t>
+      </w:r>
+      <w:proofErr w:type="spellStart"/>
+      <w:r>
+        <w:rPr>
+          <w:lang w:val="en-US"/>
+        </w:rPr>
+        <w:t>Používa</w:t>
+      </w:r>
+      <w:proofErr w:type="spellEnd"/>
+      <w:r>
+        <w:rPr>
+          <w:lang w:val="en-US"/>
+        </w:rPr>
+        <w:t xml:space="preserve"> </w:t>
+      </w:r>
+      <w:proofErr w:type="spellStart"/>
+      <w:r>
+        <w:rPr>
+          <w:lang w:val="en-US"/>
+        </w:rPr>
+        <w:t>sa</w:t>
+      </w:r>
+      <w:proofErr w:type="spellEnd"/>
+      <w:r>
+        <w:rPr>
+          <w:lang w:val="en-US"/>
+        </w:rPr>
+        <w:t xml:space="preserve"> </w:t>
+      </w:r>
+      <w:proofErr w:type="spellStart"/>
+      <w:r>
+        <w:rPr>
+          <w:lang w:val="en-US"/>
+        </w:rPr>
+        <w:t>na</w:t>
+      </w:r>
+      <w:proofErr w:type="spellEnd"/>
+      <w:r>
+        <w:rPr>
+          <w:lang w:val="en-US"/>
+        </w:rPr>
+        <w:t xml:space="preserve"> HTML </w:t>
+      </w:r>
+      <w:proofErr w:type="spellStart"/>
+      <w:r>
+        <w:rPr>
+          <w:lang w:val="en-US"/>
+        </w:rPr>
+        <w:t>formuláre</w:t>
+      </w:r>
+      <w:proofErr w:type="spellEnd"/>
+      <w:r>
+        <w:rPr>
+          <w:lang w:val="en-US"/>
+        </w:rPr>
+        <w:t xml:space="preserve"> </w:t>
+      </w:r>
+      <w:proofErr w:type="spellStart"/>
+      <w:r>
+        <w:rPr>
+          <w:lang w:val="en-US"/>
+        </w:rPr>
+        <w:t>na</w:t>
+      </w:r>
+      <w:proofErr w:type="spellEnd"/>
+      <w:r>
+        <w:rPr>
+          <w:lang w:val="en-US"/>
+        </w:rPr>
+        <w:t xml:space="preserve"> </w:t>
+      </w:r>
+      <w:proofErr w:type="spellStart"/>
+      <w:r>
+        <w:rPr>
+          <w:lang w:val="en-US"/>
+        </w:rPr>
+        <w:t>zber</w:t>
+      </w:r>
+      <w:proofErr w:type="spellEnd"/>
+      <w:r>
+        <w:rPr>
+          <w:lang w:val="en-US"/>
+        </w:rPr>
+        <w:t xml:space="preserve"> </w:t>
+      </w:r>
+      <w:proofErr w:type="spellStart"/>
+      <w:r>
+        <w:rPr>
+          <w:lang w:val="en-US"/>
+        </w:rPr>
+        <w:t>vstupov</w:t>
+      </w:r>
+      <w:proofErr w:type="spellEnd"/>
+      <w:r>
+        <w:rPr>
+          <w:lang w:val="en-US"/>
+        </w:rPr>
+        <w:t xml:space="preserve"> </w:t>
+      </w:r>
+      <w:proofErr w:type="spellStart"/>
+      <w:r>
+        <w:rPr>
+          <w:lang w:val="en-US"/>
+        </w:rPr>
+        <w:t>používateľa</w:t>
+      </w:r>
+      <w:proofErr w:type="spellEnd"/>
+      <w:r>
+        <w:rPr>
+          <w:lang w:val="en-US"/>
+        </w:rPr>
+        <w:t>.</w:t>
       </w:r>
     </w:p>
     <w:p>
@@ -235,13 +601,129 @@
           <w:bCs/>
           <w:lang w:val="en-US"/>
         </w:rPr>
-        <w:t>&lt;sekcia&gt;, &lt;article&gt;, &lt;nav&gt;, &lt;aside&gt;, &lt;header&gt;, &lt;footer&gt;:</w:t>
-      </w:r>
-      <w:r>
-        <w:rPr>
-          <w:lang w:val="en-US"/>
-        </w:rPr>
-        <w:t> Sémantické prvky, ktoré definujú oblasti webovej stránky.</w:t>
+        <w:t>&lt;</w:t>
+      </w:r>
+      <w:proofErr w:type="spellStart"/>
+      <w:r>
+        <w:rPr>
+          <w:b/>
+          <w:bCs/>
+          <w:lang w:val="en-US"/>
+        </w:rPr>
+        <w:t>sekcia</w:t>
+      </w:r>
+      <w:proofErr w:type="spellEnd"/>
+      <w:r>
+        <w:rPr>
+          <w:b/>
+          <w:bCs/>
+          <w:lang w:val="en-US"/>
+        </w:rPr>
+        <w:t>&gt;, &lt;article&gt;, &lt;nav&gt;, &lt;aside&gt;, &lt;header&gt;, &lt;footer&gt;:</w:t>
+      </w:r>
+      <w:r>
+        <w:rPr>
+          <w:lang w:val="en-US"/>
+        </w:rPr>
+        <w:t> </w:t>
+      </w:r>
+      <w:proofErr w:type="spellStart"/>
+      <w:r>
+        <w:rPr>
+          <w:lang w:val="en-US"/>
+        </w:rPr>
+        <w:t>Sémantické</w:t>
+      </w:r>
+      <w:proofErr w:type="spellEnd"/>
+      <w:r>
+        <w:rPr>
+          <w:lang w:val="en-US"/>
+        </w:rPr>
+        <w:t xml:space="preserve"> </w:t>
+      </w:r>
+      <w:proofErr w:type="spellStart"/>
+      <w:r>
+        <w:rPr>
+          <w:lang w:val="en-US"/>
+        </w:rPr>
+        <w:t>prvky</w:t>
+      </w:r>
+      <w:proofErr w:type="spellEnd"/>
+      <w:r>
+        <w:rPr>
+          <w:lang w:val="en-US"/>
+        </w:rPr>
+        <w:t xml:space="preserve">, </w:t>
+      </w:r>
+      <w:proofErr w:type="spellStart"/>
+      <w:r>
+        <w:rPr>
+          <w:lang w:val="en-US"/>
+        </w:rPr>
+        <w:t>ktoré</w:t>
+      </w:r>
+      <w:proofErr w:type="spellEnd"/>
+      <w:r>
+        <w:rPr>
+          <w:lang w:val="en-US"/>
+        </w:rPr>
+        <w:t xml:space="preserve"> </w:t>
+      </w:r>
+      <w:proofErr w:type="spellStart"/>
+      <w:r>
+        <w:rPr>
+          <w:lang w:val="en-US"/>
+        </w:rPr>
+        <w:t>definujú</w:t>
+      </w:r>
+      <w:proofErr w:type="spellEnd"/>
+      <w:r>
+        <w:rPr>
+          <w:lang w:val="en-US"/>
+        </w:rPr>
+        <w:t xml:space="preserve"> </w:t>
+      </w:r>
+      <w:proofErr w:type="spellStart"/>
+      <w:r>
+        <w:rPr>
+          <w:lang w:val="en-US"/>
+        </w:rPr>
+        <w:t>oblasti</w:t>
+      </w:r>
+      <w:proofErr w:type="spellEnd"/>
+      <w:r>
+        <w:rPr>
+          <w:lang w:val="en-US"/>
+        </w:rPr>
+        <w:t xml:space="preserve"> </w:t>
+      </w:r>
+      <w:proofErr w:type="spellStart"/>
+      <w:r>
+        <w:rPr>
+          <w:lang w:val="en-US"/>
+        </w:rPr>
+        <w:t>webovej</w:t>
+      </w:r>
+      <w:proofErr w:type="spellEnd"/>
+      <w:r>
+        <w:rPr>
+          <w:lang w:val="en-US"/>
+        </w:rPr>
+        <w:t xml:space="preserve"> </w:t>
+      </w:r>
+      <w:proofErr w:type="spellStart"/>
+      <w:r>
+        <w:rPr>
+          <w:lang w:val="en-US"/>
+        </w:rPr>
+        <w:t>stránky</w:t>
+      </w:r>
+      <w:proofErr w:type="spellEnd"/>
+      <w:r>
+        <w:rPr>
+          <w:lang w:val="en-US"/>
+        </w:rPr>
+        <w:t>.</w:t>
       </w:r>
     </w:p>
     <w:p>
@@ -266,8 +748,16 @@
         <w:rPr>
           <w:lang w:val="en-US"/>
         </w:rPr>
-        <w:t>Inline prvky</w:t>
-      </w:r>
+        <w:t xml:space="preserve">Inline </w:t>
+      </w:r>
+      <w:proofErr w:type="spellStart"/>
+      <w:r>
+        <w:rPr>
+          <w:lang w:val="en-US"/>
+        </w:rPr>
+        <w:t>prvky</w:t>
+      </w:r>
+      <w:proofErr w:type="spellEnd"/>
     </w:p>
     <w:p>
       <w:pPr>
@@ -295,11 +785,61 @@
         </w:rPr>
         <w:t xml:space="preserve"> </w:t>
       </w:r>
+      <w:proofErr w:type="spellStart"/>
       <w:r>
         <w:rPr>
           <w:lang w:val="de-DE"/>
         </w:rPr>
-        <w:t>Univerzálny inline kontajner na frázovanie obsahu.</w:t>
+        <w:t>Univerzálny</w:t>
+      </w:r>
+      <w:proofErr w:type="spellEnd"/>
+      <w:r>
+        <w:rPr>
+          <w:lang w:val="de-DE"/>
+        </w:rPr>
+        <w:t xml:space="preserve"> inline </w:t>
+      </w:r>
+      <w:proofErr w:type="spellStart"/>
+      <w:r>
+        <w:rPr>
+          <w:lang w:val="de-DE"/>
+        </w:rPr>
+        <w:t>kontajner</w:t>
+      </w:r>
+      <w:proofErr w:type="spellEnd"/>
+      <w:r>
+        <w:rPr>
+          <w:lang w:val="de-DE"/>
+        </w:rPr>
+        <w:t xml:space="preserve"> na </w:t>
+      </w:r>
+      <w:proofErr w:type="spellStart"/>
+      <w:r>
+        <w:rPr>
+          <w:lang w:val="de-DE"/>
+        </w:rPr>
+        <w:t>frázovanie</w:t>
+      </w:r>
+      <w:proofErr w:type="spellEnd"/>
+      <w:r>
+        <w:rPr>
+          <w:lang w:val="de-DE"/>
+        </w:rPr>
+        <w:t xml:space="preserve"> </w:t>
+      </w:r>
+      <w:proofErr w:type="spellStart"/>
+      <w:r>
+        <w:rPr>
+          <w:lang w:val="de-DE"/>
+        </w:rPr>
+        <w:t>obsahu</w:t>
+      </w:r>
+      <w:proofErr w:type="spellEnd"/>
+      <w:r>
+        <w:rPr>
+          <w:lang w:val="de-DE"/>
+        </w:rPr>
+        <w:t>.</w:t>
       </w:r>
     </w:p>
     <w:p>
@@ -320,11 +860,47 @@
         </w:rPr>
         <w:t>&lt;a&gt;: </w:t>
       </w:r>
-      <w:r>
-        <w:rPr>
-          <w:lang w:val="en-US"/>
-        </w:rPr>
-        <w:t>Vytvára hypertextové odkazy.</w:t>
+      <w:proofErr w:type="spellStart"/>
+      <w:r>
+        <w:rPr>
+          <w:lang w:val="en-US"/>
+        </w:rPr>
+        <w:t>Vytvára</w:t>
+      </w:r>
+      <w:proofErr w:type="spellEnd"/>
+      <w:r>
+        <w:rPr>
+          <w:lang w:val="en-US"/>
+        </w:rPr>
+        <w:t xml:space="preserve"> </w:t>
+      </w:r>
+      <w:proofErr w:type="spellStart"/>
+      <w:r>
+        <w:rPr>
+          <w:lang w:val="en-US"/>
+        </w:rPr>
+        <w:t>hypertextové</w:t>
+      </w:r>
+      <w:proofErr w:type="spellEnd"/>
+      <w:r>
+        <w:rPr>
+          <w:lang w:val="en-US"/>
+        </w:rPr>
+        <w:t xml:space="preserve"> </w:t>
+      </w:r>
+      <w:proofErr w:type="spellStart"/>
+      <w:r>
+        <w:rPr>
+          <w:lang w:val="en-US"/>
+        </w:rPr>
+        <w:t>odkazy</w:t>
+      </w:r>
+      <w:proofErr w:type="spellEnd"/>
+      <w:r>
+        <w:rPr>
+          <w:lang w:val="en-US"/>
+        </w:rPr>
+        <w:t>.</w:t>
       </w:r>
     </w:p>
     <w:p>
@@ -343,13 +919,59 @@
           <w:bCs/>
           <w:lang w:val="en-US"/>
         </w:rPr>
-        <w:t>&lt;img&gt;:</w:t>
-      </w:r>
-      <w:r>
-        <w:rPr>
-          <w:lang w:val="en-US"/>
-        </w:rPr>
-        <w:t> Vkladá obraz.</w:t>
+        <w:t>&lt;</w:t>
+      </w:r>
+      <w:proofErr w:type="spellStart"/>
+      <w:r>
+        <w:rPr>
+          <w:b/>
+          <w:bCs/>
+          <w:lang w:val="en-US"/>
+        </w:rPr>
+        <w:t>img</w:t>
+      </w:r>
+      <w:proofErr w:type="spellEnd"/>
+      <w:r>
+        <w:rPr>
+          <w:b/>
+          <w:bCs/>
+          <w:lang w:val="en-US"/>
+        </w:rPr>
+        <w:t>&gt;:</w:t>
+      </w:r>
+      <w:r>
+        <w:rPr>
+          <w:lang w:val="en-US"/>
+        </w:rPr>
+        <w:t> </w:t>
+      </w:r>
+      <w:proofErr w:type="spellStart"/>
+      <w:r>
+        <w:rPr>
+          <w:lang w:val="en-US"/>
+        </w:rPr>
+        <w:t>Vkladá</w:t>
+      </w:r>
+      <w:proofErr w:type="spellEnd"/>
+      <w:r>
+        <w:rPr>
+          <w:lang w:val="en-US"/>
+        </w:rPr>
+        <w:t xml:space="preserve"> </w:t>
+      </w:r>
+      <w:proofErr w:type="spellStart"/>
+      <w:r>
+        <w:rPr>
+          <w:lang w:val="en-US"/>
+        </w:rPr>
+        <w:t>obraz</w:t>
+      </w:r>
+      <w:proofErr w:type="spellEnd"/>
+      <w:r>
+        <w:rPr>
+          <w:lang w:val="en-US"/>
+        </w:rPr>
+        <w:t>.</w:t>
       </w:r>
     </w:p>
     <w:p>
@@ -374,7 +996,105 @@
         <w:rPr>
           <w:lang w:val="en-US"/>
         </w:rPr>
-        <w:t> Používa sa na silné zdôraznenie a tučné písmo.</w:t>
+        <w:t> </w:t>
+      </w:r>
+      <w:proofErr w:type="spellStart"/>
+      <w:r>
+        <w:rPr>
+          <w:lang w:val="en-US"/>
+        </w:rPr>
+        <w:t>Používa</w:t>
+      </w:r>
+      <w:proofErr w:type="spellEnd"/>
+      <w:r>
+        <w:rPr>
+          <w:lang w:val="en-US"/>
+        </w:rPr>
+        <w:t xml:space="preserve"> </w:t>
+      </w:r>
+      <w:proofErr w:type="spellStart"/>
+      <w:r>
+        <w:rPr>
+          <w:lang w:val="en-US"/>
+        </w:rPr>
+        <w:t>sa</w:t>
+      </w:r>
+      <w:proofErr w:type="spellEnd"/>
+      <w:r>
+        <w:rPr>
+          <w:lang w:val="en-US"/>
+        </w:rPr>
+        <w:t xml:space="preserve"> </w:t>
+      </w:r>
+      <w:proofErr w:type="spellStart"/>
+      <w:r>
+        <w:rPr>
+          <w:lang w:val="en-US"/>
+        </w:rPr>
+        <w:t>na</w:t>
+      </w:r>
+      <w:proofErr w:type="spellEnd"/>
+      <w:r>
+        <w:rPr>
+          <w:lang w:val="en-US"/>
+        </w:rPr>
+        <w:t xml:space="preserve"> </w:t>
+      </w:r>
+      <w:proofErr w:type="spellStart"/>
+      <w:r>
+        <w:rPr>
+          <w:lang w:val="en-US"/>
+        </w:rPr>
+        <w:t>silné</w:t>
+      </w:r>
+      <w:proofErr w:type="spellEnd"/>
+      <w:r>
+        <w:rPr>
+          <w:lang w:val="en-US"/>
+        </w:rPr>
+        <w:t xml:space="preserve"> </w:t>
+      </w:r>
+      <w:proofErr w:type="spellStart"/>
+      <w:r>
+        <w:rPr>
+          <w:lang w:val="en-US"/>
+        </w:rPr>
+        <w:t>zdôraznenie</w:t>
+      </w:r>
+      <w:proofErr w:type="spellEnd"/>
+      <w:r>
+        <w:rPr>
+          <w:lang w:val="en-US"/>
+        </w:rPr>
+        <w:t xml:space="preserve"> a </w:t>
+      </w:r>
+      <w:proofErr w:type="spellStart"/>
+      <w:r>
+        <w:rPr>
+          <w:lang w:val="en-US"/>
+        </w:rPr>
+        <w:t>tučné</w:t>
+      </w:r>
+      <w:proofErr w:type="spellEnd"/>
+      <w:r>
+        <w:rPr>
+          <w:lang w:val="en-US"/>
+        </w:rPr>
+        <w:t> </w:t>
+      </w:r>
+      <w:proofErr w:type="spellStart"/>
+      <w:r>
+        <w:rPr>
+          <w:lang w:val="en-US"/>
+        </w:rPr>
+        <w:t>písmo</w:t>
+      </w:r>
+      <w:proofErr w:type="spellEnd"/>
+      <w:r>
+        <w:rPr>
+          <w:lang w:val="en-US"/>
+        </w:rPr>
+        <w:t>.</w:t>
       </w:r>
     </w:p>
     <w:p>
@@ -393,13 +1113,119 @@
           <w:bCs/>
           <w:lang w:val="en-US"/>
         </w:rPr>
-        <w:t>&lt;em&gt;, &lt;i&gt;:</w:t>
-      </w:r>
-      <w:r>
-        <w:rPr>
-          <w:lang w:val="en-US"/>
-        </w:rPr>
-        <w:t> Používa sa na zdôraznenie a kurzívu.</w:t>
+        <w:t>&lt;</w:t>
+      </w:r>
+      <w:proofErr w:type="spellStart"/>
+      <w:r>
+        <w:rPr>
+          <w:b/>
+          <w:bCs/>
+          <w:lang w:val="en-US"/>
+        </w:rPr>
+        <w:t>em</w:t>
+      </w:r>
+      <w:proofErr w:type="spellEnd"/>
+      <w:r>
+        <w:rPr>
+          <w:b/>
+          <w:bCs/>
+          <w:lang w:val="en-US"/>
+        </w:rPr>
+        <w:t>&gt;, &lt;</w:t>
+      </w:r>
+      <w:proofErr w:type="spellStart"/>
+      <w:r>
+        <w:rPr>
+          <w:b/>
+          <w:bCs/>
+          <w:lang w:val="en-US"/>
+        </w:rPr>
+        <w:t>i</w:t>
+      </w:r>
+      <w:proofErr w:type="spellEnd"/>
+      <w:r>
+        <w:rPr>
+          <w:b/>
+          <w:bCs/>
+          <w:lang w:val="en-US"/>
+        </w:rPr>
+        <w:t>&gt;:</w:t>
+      </w:r>
+      <w:r>
+        <w:rPr>
+          <w:lang w:val="en-US"/>
+        </w:rPr>
+        <w:t> </w:t>
+      </w:r>
+      <w:proofErr w:type="spellStart"/>
+      <w:r>
+        <w:rPr>
+          <w:lang w:val="en-US"/>
+        </w:rPr>
+        <w:t>Používa</w:t>
+      </w:r>
+      <w:proofErr w:type="spellEnd"/>
+      <w:r>
+        <w:rPr>
+          <w:lang w:val="en-US"/>
+        </w:rPr>
+        <w:t xml:space="preserve"> </w:t>
+      </w:r>
+      <w:proofErr w:type="spellStart"/>
+      <w:r>
+        <w:rPr>
+          <w:lang w:val="en-US"/>
+        </w:rPr>
+        <w:t>sa</w:t>
+      </w:r>
+      <w:proofErr w:type="spellEnd"/>
+      <w:r>
+        <w:rPr>
+          <w:lang w:val="en-US"/>
+        </w:rPr>
+        <w:t xml:space="preserve"> </w:t>
+      </w:r>
+      <w:proofErr w:type="spellStart"/>
+      <w:r>
+        <w:rPr>
+          <w:lang w:val="en-US"/>
+        </w:rPr>
+        <w:t>na</w:t>
+      </w:r>
+      <w:proofErr w:type="spellEnd"/>
+      <w:r>
+        <w:rPr>
+          <w:lang w:val="en-US"/>
+        </w:rPr>
+        <w:t xml:space="preserve"> </w:t>
+      </w:r>
+      <w:proofErr w:type="spellStart"/>
+      <w:r>
+        <w:rPr>
+          <w:lang w:val="en-US"/>
+        </w:rPr>
+        <w:t>zdôraznenie</w:t>
+      </w:r>
+      <w:proofErr w:type="spellEnd"/>
+      <w:r>
+        <w:rPr>
+          <w:lang w:val="en-US"/>
+        </w:rPr>
+        <w:t xml:space="preserve"> a </w:t>
+      </w:r>
+      <w:proofErr w:type="spellStart"/>
+      <w:r>
+        <w:rPr>
+          <w:lang w:val="en-US"/>
+        </w:rPr>
+        <w:t>kurzívu</w:t>
+      </w:r>
+      <w:proofErr w:type="spellEnd"/>
+      <w:r>
+        <w:rPr>
+          <w:lang w:val="en-US"/>
+        </w:rPr>
+        <w:t>.</w:t>
       </w:r>
     </w:p>
     <w:p>
@@ -418,13 +1244,87 @@
           <w:bCs/>
           <w:lang w:val="en-US"/>
         </w:rPr>
-        <w:t>&lt;br&gt;:</w:t>
-      </w:r>
-      <w:r>
-        <w:rPr>
-          <w:lang w:val="en-US"/>
-        </w:rPr>
-        <w:t> Vloží zalomenie riadku do textu.</w:t>
+        <w:t>&lt;</w:t>
+      </w:r>
+      <w:proofErr w:type="spellStart"/>
+      <w:r>
+        <w:rPr>
+          <w:b/>
+          <w:bCs/>
+          <w:lang w:val="en-US"/>
+        </w:rPr>
+        <w:t>br</w:t>
+      </w:r>
+      <w:proofErr w:type="spellEnd"/>
+      <w:r>
+        <w:rPr>
+          <w:b/>
+          <w:bCs/>
+          <w:lang w:val="en-US"/>
+        </w:rPr>
+        <w:t>&gt;:</w:t>
+      </w:r>
+      <w:r>
+        <w:rPr>
+          <w:lang w:val="en-US"/>
+        </w:rPr>
+        <w:t> </w:t>
+      </w:r>
+      <w:proofErr w:type="spellStart"/>
+      <w:r>
+        <w:rPr>
+          <w:lang w:val="en-US"/>
+        </w:rPr>
+        <w:t>Vloží</w:t>
+      </w:r>
+      <w:proofErr w:type="spellEnd"/>
+      <w:r>
+        <w:rPr>
+          <w:lang w:val="en-US"/>
+        </w:rPr>
+        <w:t xml:space="preserve"> </w:t>
+      </w:r>
+      <w:proofErr w:type="spellStart"/>
+      <w:r>
+        <w:rPr>
+          <w:lang w:val="en-US"/>
+        </w:rPr>
+        <w:t>zalomenie</w:t>
+      </w:r>
+      <w:proofErr w:type="spellEnd"/>
+      <w:r>
+        <w:rPr>
+          <w:lang w:val="en-US"/>
+        </w:rPr>
+        <w:t xml:space="preserve"> </w:t>
+      </w:r>
+      <w:proofErr w:type="spellStart"/>
+      <w:r>
+        <w:rPr>
+          <w:lang w:val="en-US"/>
+        </w:rPr>
+        <w:t>riadku</w:t>
+      </w:r>
+      <w:proofErr w:type="spellEnd"/>
+      <w:r>
+        <w:rPr>
+          <w:lang w:val="en-US"/>
+        </w:rPr>
+        <w:t xml:space="preserve"> do </w:t>
+      </w:r>
+      <w:proofErr w:type="spellStart"/>
+      <w:r>
+        <w:rPr>
+          <w:lang w:val="en-US"/>
+        </w:rPr>
+        <w:t>textu</w:t>
+      </w:r>
+      <w:proofErr w:type="spellEnd"/>
+      <w:r>
+        <w:rPr>
+          <w:lang w:val="en-US"/>
+        </w:rPr>
+        <w:t>.</w:t>
       </w:r>
     </w:p>
     <w:p>
@@ -449,7 +1349,77 @@
         <w:rPr>
           <w:lang w:val="en-US"/>
         </w:rPr>
-        <w:t> Vytvára interaktívne ovládacie prvky pre formuláre.</w:t>
+        <w:t> </w:t>
+      </w:r>
+      <w:proofErr w:type="spellStart"/>
+      <w:r>
+        <w:rPr>
+          <w:lang w:val="en-US"/>
+        </w:rPr>
+        <w:t>Vytvára</w:t>
+      </w:r>
+      <w:proofErr w:type="spellEnd"/>
+      <w:r>
+        <w:rPr>
+          <w:lang w:val="en-US"/>
+        </w:rPr>
+        <w:t xml:space="preserve"> </w:t>
+      </w:r>
+      <w:proofErr w:type="spellStart"/>
+      <w:r>
+        <w:rPr>
+          <w:lang w:val="en-US"/>
+        </w:rPr>
+        <w:t>interaktívne</w:t>
+      </w:r>
+      <w:proofErr w:type="spellEnd"/>
+      <w:r>
+        <w:rPr>
+          <w:lang w:val="en-US"/>
+        </w:rPr>
+        <w:t xml:space="preserve"> </w:t>
+      </w:r>
+      <w:proofErr w:type="spellStart"/>
+      <w:r>
+        <w:rPr>
+          <w:lang w:val="en-US"/>
+        </w:rPr>
+        <w:t>ovládacie</w:t>
+      </w:r>
+      <w:proofErr w:type="spellEnd"/>
+      <w:r>
+        <w:rPr>
+          <w:lang w:val="en-US"/>
+        </w:rPr>
+        <w:t xml:space="preserve"> </w:t>
+      </w:r>
+      <w:proofErr w:type="spellStart"/>
+      <w:r>
+        <w:rPr>
+          <w:lang w:val="en-US"/>
+        </w:rPr>
+        <w:t>prvky</w:t>
+      </w:r>
+      <w:proofErr w:type="spellEnd"/>
+      <w:r>
+        <w:rPr>
+          <w:lang w:val="en-US"/>
+        </w:rPr>
+        <w:t xml:space="preserve"> pre </w:t>
+      </w:r>
+      <w:proofErr w:type="spellStart"/>
+      <w:r>
+        <w:rPr>
+          <w:lang w:val="en-US"/>
+        </w:rPr>
+        <w:t>formuláre</w:t>
+      </w:r>
+      <w:proofErr w:type="spellEnd"/>
+      <w:r>
+        <w:rPr>
+          <w:lang w:val="en-US"/>
+        </w:rPr>
+        <w:t>.</w:t>
       </w:r>
     </w:p>
     <w:p>
@@ -463,6 +1433,7 @@
       <w:pPr>
         <w:pStyle w:val="Heading2"/>
       </w:pPr>
+      <w:proofErr w:type="spellStart"/>
       <w:r>
         <w:rPr>
           <w:lang w:val="en-US"/>
@@ -472,6 +1443,7 @@
       <w:r>
         <w:t>úty</w:t>
       </w:r>
+      <w:proofErr w:type="spellEnd"/>
     </w:p>
     <w:p>
       <w:hyperlink r:id="rId7" w:history="1">
@@ -537,7 +1509,15 @@
         <w:t>Atribúty obrazu</w:t>
       </w:r>
       <w:r>
-        <w:t> – špecifické pre prvok &lt;img&gt; na spracovanie obrázkov.</w:t>
+        <w:t> – špecifické pre prvok &lt;</w:t>
+      </w:r>
+      <w:proofErr w:type="spellStart"/>
+      <w:r>
+        <w:t>img</w:t>
+      </w:r>
+      <w:proofErr w:type="spellEnd"/>
+      <w:r>
+        <w:t>&gt; na spracovanie obrázkov.</w:t>
       </w:r>
     </w:p>
     <w:p>
@@ -550,19 +1530,95 @@
           <w:lang w:val="en-US"/>
         </w:rPr>
       </w:pPr>
+      <w:proofErr w:type="spellStart"/>
       <w:r>
         <w:rPr>
           <w:b/>
           <w:bCs/>
           <w:lang w:val="en-US"/>
         </w:rPr>
-        <w:t>Atribúty odkazov</w:t>
-      </w:r>
-      <w:r>
-        <w:rPr>
-          <w:lang w:val="en-US"/>
-        </w:rPr>
-        <w:t> – špecifické pre prvky prepojenia ako &lt;a&gt; a &lt;link&gt;.</w:t>
+        <w:t>Atribúty</w:t>
+      </w:r>
+      <w:proofErr w:type="spellEnd"/>
+      <w:r>
+        <w:rPr>
+          <w:b/>
+          <w:bCs/>
+          <w:lang w:val="en-US"/>
+        </w:rPr>
+        <w:t xml:space="preserve"> </w:t>
+      </w:r>
+      <w:proofErr w:type="spellStart"/>
+      <w:r>
+        <w:rPr>
+          <w:b/>
+          <w:bCs/>
+          <w:lang w:val="en-US"/>
+        </w:rPr>
+        <w:t>odkazov</w:t>
+      </w:r>
+      <w:proofErr w:type="spellEnd"/>
+      <w:r>
+        <w:rPr>
+          <w:lang w:val="en-US"/>
+        </w:rPr>
+        <w:t xml:space="preserve"> – </w:t>
+      </w:r>
+      <w:proofErr w:type="spellStart"/>
+      <w:r>
+        <w:rPr>
+          <w:lang w:val="en-US"/>
+        </w:rPr>
+        <w:t>špecifické</w:t>
+      </w:r>
+      <w:proofErr w:type="spellEnd"/>
+      <w:r>
+        <w:rPr>
+          <w:lang w:val="en-US"/>
+        </w:rPr>
+        <w:t xml:space="preserve"> pre </w:t>
+      </w:r>
+      <w:proofErr w:type="spellStart"/>
+      <w:r>
+        <w:rPr>
+          <w:lang w:val="en-US"/>
+        </w:rPr>
+        <w:t>prvky</w:t>
+      </w:r>
+      <w:proofErr w:type="spellEnd"/>
+      <w:r>
+        <w:rPr>
+          <w:lang w:val="en-US"/>
+        </w:rPr>
+        <w:t xml:space="preserve"> </w:t>
+      </w:r>
+      <w:proofErr w:type="spellStart"/>
+      <w:r>
+        <w:rPr>
+          <w:lang w:val="en-US"/>
+        </w:rPr>
+        <w:t>prepojenia</w:t>
+      </w:r>
+      <w:proofErr w:type="spellEnd"/>
+      <w:r>
+        <w:rPr>
+          <w:lang w:val="en-US"/>
+        </w:rPr>
+        <w:t xml:space="preserve"> </w:t>
+      </w:r>
+      <w:proofErr w:type="spellStart"/>
+      <w:r>
+        <w:rPr>
+          <w:lang w:val="en-US"/>
+        </w:rPr>
+        <w:t>ako</w:t>
+      </w:r>
+      <w:proofErr w:type="spellEnd"/>
+      <w:r>
+        <w:rPr>
+          <w:lang w:val="en-US"/>
+        </w:rPr>
+        <w:t xml:space="preserve"> &lt;a&gt; a &lt;link&gt;.</w:t>
       </w:r>
     </w:p>
     <w:p>
@@ -575,19 +1631,137 @@
           <w:lang w:val="en-US"/>
         </w:rPr>
       </w:pPr>
+      <w:proofErr w:type="spellStart"/>
       <w:r>
         <w:rPr>
           <w:b/>
           <w:bCs/>
           <w:lang w:val="en-US"/>
         </w:rPr>
-        <w:t>Atribúty tabuľky</w:t>
-      </w:r>
-      <w:r>
-        <w:rPr>
-          <w:lang w:val="en-US"/>
-        </w:rPr>
-        <w:t> - Používajú sa s prvkami tabuľky ako &lt;table&gt; , &lt;th&gt;, &lt;tr&gt; a &lt;td&gt;.</w:t>
+        <w:t>Atribúty</w:t>
+      </w:r>
+      <w:proofErr w:type="spellEnd"/>
+      <w:r>
+        <w:rPr>
+          <w:b/>
+          <w:bCs/>
+          <w:lang w:val="en-US"/>
+        </w:rPr>
+        <w:t xml:space="preserve"> </w:t>
+      </w:r>
+      <w:proofErr w:type="spellStart"/>
+      <w:r>
+        <w:rPr>
+          <w:b/>
+          <w:bCs/>
+          <w:lang w:val="en-US"/>
+        </w:rPr>
+        <w:t>tabuľky</w:t>
+      </w:r>
+      <w:proofErr w:type="spellEnd"/>
+      <w:r>
+        <w:rPr>
+          <w:lang w:val="en-US"/>
+        </w:rPr>
+        <w:t xml:space="preserve"> - </w:t>
+      </w:r>
+      <w:proofErr w:type="spellStart"/>
+      <w:r>
+        <w:rPr>
+          <w:lang w:val="en-US"/>
+        </w:rPr>
+        <w:t>Používajú</w:t>
+      </w:r>
+      <w:proofErr w:type="spellEnd"/>
+      <w:r>
+        <w:rPr>
+          <w:lang w:val="en-US"/>
+        </w:rPr>
+        <w:t xml:space="preserve"> </w:t>
+      </w:r>
+      <w:proofErr w:type="spellStart"/>
+      <w:r>
+        <w:rPr>
+          <w:lang w:val="en-US"/>
+        </w:rPr>
+        <w:t>sa</w:t>
+      </w:r>
+      <w:proofErr w:type="spellEnd"/>
+      <w:r>
+        <w:rPr>
+          <w:lang w:val="en-US"/>
+        </w:rPr>
+        <w:t xml:space="preserve"> s </w:t>
+      </w:r>
+      <w:proofErr w:type="spellStart"/>
+      <w:r>
+        <w:rPr>
+          <w:lang w:val="en-US"/>
+        </w:rPr>
+        <w:t>prvkami</w:t>
+      </w:r>
+      <w:proofErr w:type="spellEnd"/>
+      <w:r>
+        <w:rPr>
+          <w:lang w:val="en-US"/>
+        </w:rPr>
+        <w:t xml:space="preserve"> </w:t>
+      </w:r>
+      <w:proofErr w:type="spellStart"/>
+      <w:r>
+        <w:rPr>
+          <w:lang w:val="en-US"/>
+        </w:rPr>
+        <w:t>tabuľky</w:t>
+      </w:r>
+      <w:proofErr w:type="spellEnd"/>
+      <w:r>
+        <w:rPr>
+          <w:lang w:val="en-US"/>
+        </w:rPr>
+        <w:t xml:space="preserve"> </w:t>
+      </w:r>
+      <w:proofErr w:type="spellStart"/>
+      <w:r>
+        <w:rPr>
+          <w:lang w:val="en-US"/>
+        </w:rPr>
+        <w:t>ako</w:t>
+      </w:r>
+      <w:proofErr w:type="spellEnd"/>
+      <w:r>
+        <w:rPr>
+          <w:lang w:val="en-US"/>
+        </w:rPr>
+        <w:t xml:space="preserve"> &lt;table</w:t>
+      </w:r>
+      <w:proofErr w:type="gramStart"/>
+      <w:r>
+        <w:rPr>
+          <w:lang w:val="en-US"/>
+        </w:rPr>
+        <w:t>&gt; ,</w:t>
+      </w:r>
+      <w:proofErr w:type="gramEnd"/>
+      <w:r>
+        <w:rPr>
+          <w:lang w:val="en-US"/>
+        </w:rPr>
+        <w:t xml:space="preserve"> &lt;</w:t>
+      </w:r>
+      <w:proofErr w:type="spellStart"/>
+      <w:r>
+        <w:rPr>
+          <w:lang w:val="en-US"/>
+        </w:rPr>
+        <w:t>th</w:t>
+      </w:r>
+      <w:proofErr w:type="spellEnd"/>
+      <w:r>
+        <w:rPr>
+          <w:lang w:val="en-US"/>
+        </w:rPr>
+        <w:t>&gt;, &lt;tr&gt; a &lt;td&gt;.</w:t>
       </w:r>
     </w:p>
     <w:p>
@@ -600,19 +1774,109 @@
           <w:lang w:val="en-US"/>
         </w:rPr>
       </w:pPr>
+      <w:proofErr w:type="spellStart"/>
       <w:r>
         <w:rPr>
           <w:b/>
           <w:bCs/>
           <w:lang w:val="en-US"/>
         </w:rPr>
-        <w:t>Atribúty štýlu</w:t>
-      </w:r>
-      <w:r>
-        <w:rPr>
-          <w:lang w:val="en-US"/>
-        </w:rPr>
-        <w:t> – Definujte štýly priamo na prvku.</w:t>
+        <w:t>Atribúty</w:t>
+      </w:r>
+      <w:proofErr w:type="spellEnd"/>
+      <w:r>
+        <w:rPr>
+          <w:b/>
+          <w:bCs/>
+          <w:lang w:val="en-US"/>
+        </w:rPr>
+        <w:t xml:space="preserve"> </w:t>
+      </w:r>
+      <w:proofErr w:type="spellStart"/>
+      <w:r>
+        <w:rPr>
+          <w:b/>
+          <w:bCs/>
+          <w:lang w:val="en-US"/>
+        </w:rPr>
+        <w:t>štýlu</w:t>
+      </w:r>
+      <w:proofErr w:type="spellEnd"/>
+      <w:r>
+        <w:rPr>
+          <w:lang w:val="en-US"/>
+        </w:rPr>
+        <w:t xml:space="preserve"> – </w:t>
+      </w:r>
+      <w:proofErr w:type="spellStart"/>
+      <w:r>
+        <w:rPr>
+          <w:lang w:val="en-US"/>
+        </w:rPr>
+        <w:t>Definujte</w:t>
+      </w:r>
+      <w:proofErr w:type="spellEnd"/>
+      <w:r>
+        <w:rPr>
+          <w:lang w:val="en-US"/>
+        </w:rPr>
+        <w:t xml:space="preserve"> </w:t>
+      </w:r>
+      <w:proofErr w:type="spellStart"/>
+      <w:r>
+        <w:rPr>
+          <w:lang w:val="en-US"/>
+        </w:rPr>
+        <w:t>štýly</w:t>
+      </w:r>
+      <w:proofErr w:type="spellEnd"/>
+      <w:r>
+        <w:rPr>
+          <w:lang w:val="en-US"/>
+        </w:rPr>
+        <w:t xml:space="preserve"> </w:t>
+      </w:r>
+      <w:proofErr w:type="spellStart"/>
+      <w:r>
+        <w:rPr>
+          <w:lang w:val="en-US"/>
+        </w:rPr>
+        <w:t>priamo</w:t>
+      </w:r>
+      <w:proofErr w:type="spellEnd"/>
+      <w:r>
+        <w:rPr>
+          <w:lang w:val="en-US"/>
+        </w:rPr>
+        <w:t xml:space="preserve"> </w:t>
+      </w:r>
+      <w:proofErr w:type="spellStart"/>
+      <w:r>
+        <w:rPr>
+          <w:lang w:val="en-US"/>
+        </w:rPr>
+        <w:t>na</w:t>
+      </w:r>
+      <w:proofErr w:type="spellEnd"/>
+      <w:r>
+        <w:rPr>
+          <w:lang w:val="en-US"/>
+        </w:rPr>
+        <w:t xml:space="preserve"> </w:t>
+      </w:r>
+      <w:proofErr w:type="spellStart"/>
+      <w:r>
+        <w:rPr>
+          <w:lang w:val="en-US"/>
+        </w:rPr>
+        <w:t>prvku</w:t>
+      </w:r>
+      <w:proofErr w:type="spellEnd"/>
+      <w:r>
+        <w:rPr>
+          <w:lang w:val="en-US"/>
+        </w:rPr>
+        <w:t>.</w:t>
       </w:r>
     </w:p>
     <w:p>
@@ -625,19 +1889,95 @@
           <w:lang w:val="en-US"/>
         </w:rPr>
       </w:pPr>
+      <w:proofErr w:type="spellStart"/>
       <w:r>
         <w:rPr>
           <w:b/>
           <w:bCs/>
           <w:lang w:val="en-US"/>
         </w:rPr>
-        <w:t>Mediálne atribúty</w:t>
-      </w:r>
-      <w:r>
-        <w:rPr>
-          <w:lang w:val="en-US"/>
-        </w:rPr>
-        <w:t> – Súvisiace s mediálnymi prvkami ako &lt;audio&gt; a &lt;video&gt;.</w:t>
+        <w:t>Mediálne</w:t>
+      </w:r>
+      <w:proofErr w:type="spellEnd"/>
+      <w:r>
+        <w:rPr>
+          <w:b/>
+          <w:bCs/>
+          <w:lang w:val="en-US"/>
+        </w:rPr>
+        <w:t xml:space="preserve"> </w:t>
+      </w:r>
+      <w:proofErr w:type="spellStart"/>
+      <w:r>
+        <w:rPr>
+          <w:b/>
+          <w:bCs/>
+          <w:lang w:val="en-US"/>
+        </w:rPr>
+        <w:t>atribúty</w:t>
+      </w:r>
+      <w:proofErr w:type="spellEnd"/>
+      <w:r>
+        <w:rPr>
+          <w:lang w:val="en-US"/>
+        </w:rPr>
+        <w:t xml:space="preserve"> – </w:t>
+      </w:r>
+      <w:proofErr w:type="spellStart"/>
+      <w:r>
+        <w:rPr>
+          <w:lang w:val="en-US"/>
+        </w:rPr>
+        <w:t>Súvisiace</w:t>
+      </w:r>
+      <w:proofErr w:type="spellEnd"/>
+      <w:r>
+        <w:rPr>
+          <w:lang w:val="en-US"/>
+        </w:rPr>
+        <w:t xml:space="preserve"> s </w:t>
+      </w:r>
+      <w:proofErr w:type="spellStart"/>
+      <w:r>
+        <w:rPr>
+          <w:lang w:val="en-US"/>
+        </w:rPr>
+        <w:t>mediálnymi</w:t>
+      </w:r>
+      <w:proofErr w:type="spellEnd"/>
+      <w:r>
+        <w:rPr>
+          <w:lang w:val="en-US"/>
+        </w:rPr>
+        <w:t xml:space="preserve"> </w:t>
+      </w:r>
+      <w:proofErr w:type="spellStart"/>
+      <w:r>
+        <w:rPr>
+          <w:lang w:val="en-US"/>
+        </w:rPr>
+        <w:t>prvkami</w:t>
+      </w:r>
+      <w:proofErr w:type="spellEnd"/>
+      <w:r>
+        <w:rPr>
+          <w:lang w:val="en-US"/>
+        </w:rPr>
+        <w:t xml:space="preserve"> </w:t>
+      </w:r>
+      <w:proofErr w:type="spellStart"/>
+      <w:r>
+        <w:rPr>
+          <w:lang w:val="en-US"/>
+        </w:rPr>
+        <w:t>ako</w:t>
+      </w:r>
+      <w:proofErr w:type="spellEnd"/>
+      <w:r>
+        <w:rPr>
+          <w:lang w:val="en-US"/>
+        </w:rPr>
+        <w:t xml:space="preserve"> &lt;audio&gt; a &lt;video&gt;.</w:t>
       </w:r>
     </w:p>
     <w:p>
@@ -650,19 +1990,137 @@
           <w:lang w:val="en-US"/>
         </w:rPr>
       </w:pPr>
+      <w:proofErr w:type="spellStart"/>
       <w:r>
         <w:rPr>
           <w:b/>
           <w:bCs/>
           <w:lang w:val="en-US"/>
         </w:rPr>
-        <w:t>Atribúty prístupnosti</w:t>
-      </w:r>
-      <w:r>
-        <w:rPr>
-          <w:lang w:val="en-US"/>
-        </w:rPr>
-        <w:t> – Pomáhajú zlepšiť prístupnosť, napríklad alt pre obrázky a atribúty aria-*.</w:t>
+        <w:t>Atribúty</w:t>
+      </w:r>
+      <w:proofErr w:type="spellEnd"/>
+      <w:r>
+        <w:rPr>
+          <w:b/>
+          <w:bCs/>
+          <w:lang w:val="en-US"/>
+        </w:rPr>
+        <w:t xml:space="preserve"> </w:t>
+      </w:r>
+      <w:proofErr w:type="spellStart"/>
+      <w:r>
+        <w:rPr>
+          <w:b/>
+          <w:bCs/>
+          <w:lang w:val="en-US"/>
+        </w:rPr>
+        <w:t>prístupnosti</w:t>
+      </w:r>
+      <w:proofErr w:type="spellEnd"/>
+      <w:r>
+        <w:rPr>
+          <w:lang w:val="en-US"/>
+        </w:rPr>
+        <w:t xml:space="preserve"> – </w:t>
+      </w:r>
+      <w:proofErr w:type="spellStart"/>
+      <w:r>
+        <w:rPr>
+          <w:lang w:val="en-US"/>
+        </w:rPr>
+        <w:t>Pomáhajú</w:t>
+      </w:r>
+      <w:proofErr w:type="spellEnd"/>
+      <w:r>
+        <w:rPr>
+          <w:lang w:val="en-US"/>
+        </w:rPr>
+        <w:t xml:space="preserve"> </w:t>
+      </w:r>
+      <w:proofErr w:type="spellStart"/>
+      <w:r>
+        <w:rPr>
+          <w:lang w:val="en-US"/>
+        </w:rPr>
+        <w:t>zlepšiť</w:t>
+      </w:r>
+      <w:proofErr w:type="spellEnd"/>
+      <w:r>
+        <w:rPr>
+          <w:lang w:val="en-US"/>
+        </w:rPr>
+        <w:t xml:space="preserve"> </w:t>
+      </w:r>
+      <w:proofErr w:type="spellStart"/>
+      <w:r>
+        <w:rPr>
+          <w:lang w:val="en-US"/>
+        </w:rPr>
+        <w:t>prístupnosť</w:t>
+      </w:r>
+      <w:proofErr w:type="spellEnd"/>
+      <w:r>
+        <w:rPr>
+          <w:lang w:val="en-US"/>
+        </w:rPr>
+        <w:t xml:space="preserve">, </w:t>
+      </w:r>
+      <w:proofErr w:type="spellStart"/>
+      <w:r>
+        <w:rPr>
+          <w:lang w:val="en-US"/>
+        </w:rPr>
+        <w:t>napríklad</w:t>
+      </w:r>
+      <w:proofErr w:type="spellEnd"/>
+      <w:r>
+        <w:rPr>
+          <w:lang w:val="en-US"/>
+        </w:rPr>
+        <w:t xml:space="preserve"> alt pre </w:t>
+      </w:r>
+      <w:proofErr w:type="spellStart"/>
+      <w:r>
+        <w:rPr>
+          <w:lang w:val="en-US"/>
+        </w:rPr>
+        <w:t>obrázky</w:t>
+      </w:r>
+      <w:proofErr w:type="spellEnd"/>
+      <w:r>
+        <w:rPr>
+          <w:lang w:val="en-US"/>
+        </w:rPr>
+        <w:t xml:space="preserve"> </w:t>
+      </w:r>
+      <w:proofErr w:type="gramStart"/>
+      <w:r>
+        <w:rPr>
+          <w:lang w:val="en-US"/>
+        </w:rPr>
+        <w:t>a</w:t>
+      </w:r>
+      <w:proofErr w:type="gramEnd"/>
+      <w:r>
+        <w:rPr>
+          <w:lang w:val="en-US"/>
+        </w:rPr>
+        <w:t xml:space="preserve"> </w:t>
+      </w:r>
+      <w:proofErr w:type="spellStart"/>
+      <w:r>
+        <w:rPr>
+          <w:lang w:val="en-US"/>
+        </w:rPr>
+        <w:t>atribúty</w:t>
+      </w:r>
+      <w:proofErr w:type="spellEnd"/>
+      <w:r>
+        <w:rPr>
+          <w:lang w:val="en-US"/>
+        </w:rPr>
+        <w:t xml:space="preserve"> aria-*.</w:t>
       </w:r>
     </w:p>
     <w:p>
@@ -682,13 +2140,143 @@
           <w:lang w:val="en-US"/>
         </w:rPr>
         <w:lastRenderedPageBreak/>
-        <w:t>Meta atribúty</w:t>
-      </w:r>
-      <w:r>
-        <w:rPr>
-          <w:lang w:val="en-US"/>
-        </w:rPr>
-        <w:t> – Používajú sa spolu s meta prvkami na špecifikáciu metadát ako .  charset</w:t>
+        <w:t xml:space="preserve">Meta </w:t>
+      </w:r>
+      <w:proofErr w:type="spellStart"/>
+      <w:r>
+        <w:rPr>
+          <w:b/>
+          <w:bCs/>
+          <w:lang w:val="en-US"/>
+        </w:rPr>
+        <w:t>atribúty</w:t>
+      </w:r>
+      <w:proofErr w:type="spellEnd"/>
+      <w:r>
+        <w:rPr>
+          <w:lang w:val="en-US"/>
+        </w:rPr>
+        <w:t xml:space="preserve"> – </w:t>
+      </w:r>
+      <w:proofErr w:type="spellStart"/>
+      <w:r>
+        <w:rPr>
+          <w:lang w:val="en-US"/>
+        </w:rPr>
+        <w:t>Používajú</w:t>
+      </w:r>
+      <w:proofErr w:type="spellEnd"/>
+      <w:r>
+        <w:rPr>
+          <w:lang w:val="en-US"/>
+        </w:rPr>
+        <w:t xml:space="preserve"> </w:t>
+      </w:r>
+      <w:proofErr w:type="spellStart"/>
+      <w:r>
+        <w:rPr>
+          <w:lang w:val="en-US"/>
+        </w:rPr>
+        <w:t>sa</w:t>
+      </w:r>
+      <w:proofErr w:type="spellEnd"/>
+      <w:r>
+        <w:rPr>
+          <w:lang w:val="en-US"/>
+        </w:rPr>
+        <w:t xml:space="preserve"> </w:t>
+      </w:r>
+      <w:proofErr w:type="spellStart"/>
+      <w:r>
+        <w:rPr>
+          <w:lang w:val="en-US"/>
+        </w:rPr>
+        <w:t>spolu</w:t>
+      </w:r>
+      <w:proofErr w:type="spellEnd"/>
+      <w:r>
+        <w:rPr>
+          <w:lang w:val="en-US"/>
+        </w:rPr>
+        <w:t xml:space="preserve"> s meta </w:t>
+      </w:r>
+      <w:proofErr w:type="spellStart"/>
+      <w:r>
+        <w:rPr>
+          <w:lang w:val="en-US"/>
+        </w:rPr>
+        <w:t>prvkami</w:t>
+      </w:r>
+      <w:proofErr w:type="spellEnd"/>
+      <w:r>
+        <w:rPr>
+          <w:lang w:val="en-US"/>
+        </w:rPr>
+        <w:t xml:space="preserve"> </w:t>
+      </w:r>
+      <w:proofErr w:type="spellStart"/>
+      <w:r>
+        <w:rPr>
+          <w:lang w:val="en-US"/>
+        </w:rPr>
+        <w:t>na</w:t>
+      </w:r>
+      <w:proofErr w:type="spellEnd"/>
+      <w:r>
+        <w:rPr>
+          <w:lang w:val="en-US"/>
+        </w:rPr>
+        <w:t xml:space="preserve"> </w:t>
+      </w:r>
+      <w:proofErr w:type="spellStart"/>
+      <w:r>
+        <w:rPr>
+          <w:lang w:val="en-US"/>
+        </w:rPr>
+        <w:t>špecifikáciu</w:t>
+      </w:r>
+      <w:proofErr w:type="spellEnd"/>
+      <w:r>
+        <w:rPr>
+          <w:lang w:val="en-US"/>
+        </w:rPr>
+        <w:t xml:space="preserve"> </w:t>
+      </w:r>
+      <w:proofErr w:type="spellStart"/>
+      <w:r>
+        <w:rPr>
+          <w:lang w:val="en-US"/>
+        </w:rPr>
+        <w:t>metadát</w:t>
+      </w:r>
+      <w:proofErr w:type="spellEnd"/>
+      <w:r>
+        <w:rPr>
+          <w:lang w:val="en-US"/>
+        </w:rPr>
+        <w:t xml:space="preserve"> </w:t>
+      </w:r>
+      <w:proofErr w:type="spellStart"/>
+      <w:proofErr w:type="gramStart"/>
+      <w:r>
+        <w:rPr>
+          <w:lang w:val="en-US"/>
+        </w:rPr>
+        <w:t>ako</w:t>
+      </w:r>
+      <w:proofErr w:type="spellEnd"/>
+      <w:r>
+        <w:rPr>
+          <w:lang w:val="en-US"/>
+        </w:rPr>
+        <w:t> .</w:t>
+      </w:r>
+      <w:proofErr w:type="gramEnd"/>
+      <w:r>
+        <w:rPr>
+          <w:lang w:val="en-US"/>
+        </w:rPr>
+        <w:t>  charset</w:t>
       </w:r>
     </w:p>
     <w:p/>
@@ -705,8 +2293,13 @@
         <w:pStyle w:val="Heading4"/>
       </w:pPr>
       <w:r>
-        <w:t>HTML alt attribute</w:t>
-      </w:r>
+        <w:t xml:space="preserve">HTML alt </w:t>
+      </w:r>
+      <w:proofErr w:type="spellStart"/>
+      <w:r>
+        <w:t>attribute</w:t>
+      </w:r>
+      <w:proofErr w:type="spellEnd"/>
     </w:p>
     <w:p>
       <w:hyperlink r:id="rId8" w:history="1">
@@ -738,13 +2331,37 @@
     </w:p>
     <w:p>
       <w:r>
-        <w:t xml:space="preserve">Ak sa otvorí folder ako nový </w:t>
+        <w:t xml:space="preserve">Ak sa otvorí </w:t>
+      </w:r>
+      <w:proofErr w:type="spellStart"/>
+      <w:r>
+        <w:t>folder</w:t>
+      </w:r>
+      <w:proofErr w:type="spellEnd"/>
+      <w:r>
+        <w:t xml:space="preserve"> ako nový </w:t>
       </w:r>
       <w:r>
         <w:t>pracovný</w:t>
       </w:r>
       <w:r>
-        <w:t xml:space="preserve"> priestor, sa objaví informácie pre prípadny v pracovný priestor na GitHub-e:</w:t>
+        <w:t xml:space="preserve"> priestor, sa objaví informácie pre </w:t>
+      </w:r>
+      <w:proofErr w:type="spellStart"/>
+      <w:r>
+        <w:t>prípadny</w:t>
+      </w:r>
+      <w:proofErr w:type="spellEnd"/>
+      <w:r>
+        <w:t xml:space="preserve"> v pracovný priestor na </w:t>
+      </w:r>
+      <w:proofErr w:type="spellStart"/>
+      <w:r>
+        <w:t>GitHub</w:t>
+      </w:r>
+      <w:proofErr w:type="spellEnd"/>
+      <w:r>
+        <w:t>-e:</w:t>
       </w:r>
     </w:p>
     <w:p/>
@@ -802,8 +2419,44 @@
           <w:rPr>
             <w:rStyle w:val="Hyperlink"/>
           </w:rPr>
-          <w:t>Tutoriál: Začnite s Visual Studio Code</w:t>
+          <w:t xml:space="preserve">Tutoriál: Začnite s </w:t>
         </w:r>
+        <w:proofErr w:type="spellStart"/>
+        <w:r>
+          <w:rPr>
+            <w:rStyle w:val="Hyperlink"/>
+          </w:rPr>
+          <w:t>Visual</w:t>
+        </w:r>
+        <w:proofErr w:type="spellEnd"/>
+        <w:r>
+          <w:rPr>
+            <w:rStyle w:val="Hyperlink"/>
+          </w:rPr>
+          <w:t xml:space="preserve"> </w:t>
+        </w:r>
+        <w:proofErr w:type="spellStart"/>
+        <w:r>
+          <w:rPr>
+            <w:rStyle w:val="Hyperlink"/>
+          </w:rPr>
+          <w:t>Studio</w:t>
+        </w:r>
+        <w:proofErr w:type="spellEnd"/>
+        <w:r>
+          <w:rPr>
+            <w:rStyle w:val="Hyperlink"/>
+          </w:rPr>
+          <w:t xml:space="preserve"> </w:t>
+        </w:r>
+        <w:proofErr w:type="spellStart"/>
+        <w:r>
+          <w:rPr>
+            <w:rStyle w:val="Hyperlink"/>
+          </w:rPr>
+          <w:t>Code</w:t>
+        </w:r>
+        <w:proofErr w:type="spellEnd"/>
       </w:hyperlink>
     </w:p>
     <w:p>
@@ -822,9 +2475,27 @@
       <w:pPr>
         <w:pStyle w:val="Heading2"/>
       </w:pPr>
-      <w:r>
-        <w:t>Visual Studio Code</w:t>
-      </w:r>
+      <w:proofErr w:type="spellStart"/>
+      <w:r>
+        <w:t>Visual</w:t>
+      </w:r>
+      <w:proofErr w:type="spellEnd"/>
+      <w:r>
+        <w:t xml:space="preserve"> </w:t>
+      </w:r>
+      <w:proofErr w:type="spellStart"/>
+      <w:r>
+        <w:t>Studio</w:t>
+      </w:r>
+      <w:proofErr w:type="spellEnd"/>
+      <w:r>
+        <w:t xml:space="preserve"> </w:t>
+      </w:r>
+      <w:proofErr w:type="spellStart"/>
+      <w:r>
+        <w:t>Code</w:t>
+      </w:r>
+      <w:proofErr w:type="spellEnd"/>
       <w:r>
         <w:t>.</w:t>
       </w:r>
@@ -833,20 +2504,48 @@
       <w:pPr>
         <w:pStyle w:val="Heading3"/>
       </w:pPr>
-      <w:r>
-        <w:t>Command Palette</w:t>
-      </w:r>
+      <w:proofErr w:type="spellStart"/>
+      <w:r>
+        <w:t>Command</w:t>
+      </w:r>
+      <w:proofErr w:type="spellEnd"/>
+      <w:r>
+        <w:t xml:space="preserve"> </w:t>
+      </w:r>
+      <w:proofErr w:type="spellStart"/>
+      <w:r>
+        <w:t>Palette</w:t>
+      </w:r>
+      <w:proofErr w:type="spellEnd"/>
     </w:p>
     <w:p>
       <w:pPr>
         <w:jc w:val="both"/>
       </w:pPr>
-      <w:r>
-        <w:t>Ctrl+Shift+P alebo F1 otvára pre spustenie príkazov vo VSC</w:t>
-      </w:r>
-      <w:r>
-        <w:t xml:space="preserve"> cez command palette</w:t>
-      </w:r>
+      <w:proofErr w:type="spellStart"/>
+      <w:r>
+        <w:t>Ctrl+Shift+P</w:t>
+      </w:r>
+      <w:proofErr w:type="spellEnd"/>
+      <w:r>
+        <w:t xml:space="preserve"> alebo F1 otvára pre spustenie príkazov vo VSC</w:t>
+      </w:r>
+      <w:r>
+        <w:t xml:space="preserve"> cez </w:t>
+      </w:r>
+      <w:proofErr w:type="spellStart"/>
+      <w:r>
+        <w:t>command</w:t>
+      </w:r>
+      <w:proofErr w:type="spellEnd"/>
+      <w:r>
+        <w:t xml:space="preserve"> </w:t>
+      </w:r>
+      <w:proofErr w:type="spellStart"/>
+      <w:r>
+        <w:t>palette</w:t>
+      </w:r>
+      <w:proofErr w:type="spellEnd"/>
       <w:r>
         <w:t xml:space="preserve"> </w:t>
       </w:r>
@@ -854,23 +2553,41 @@
         <w:t xml:space="preserve">(paleta príkazov) </w:t>
       </w:r>
       <w:r>
-        <w:t>napríklad pre vytvorenie virtuálneho prostredia programovacieho jazyka Python.</w:t>
+        <w:t xml:space="preserve">napríklad pre vytvorenie virtuálneho prostredia programovacieho jazyka </w:t>
+      </w:r>
+      <w:proofErr w:type="spellStart"/>
+      <w:r>
+        <w:t>Python</w:t>
+      </w:r>
+      <w:proofErr w:type="spellEnd"/>
+      <w:r>
+        <w:t>.</w:t>
       </w:r>
     </w:p>
     <w:p>
       <w:r>
         <w:t xml:space="preserve">Podstatné je </w:t>
       </w:r>
-      <w:r>
-        <w:t>je znakom &gt; sa vykonávajú príkazy. (urobiť ukážku)</w:t>
+      <w:proofErr w:type="spellStart"/>
+      <w:r>
+        <w:t>je</w:t>
+      </w:r>
+      <w:proofErr w:type="spellEnd"/>
+      <w:r>
+        <w:t xml:space="preserve"> znakom &gt; sa vykonávajú príkazy. (urobiť ukážku)</w:t>
       </w:r>
     </w:p>
     <w:p>
       <w:pPr>
         <w:pStyle w:val="Heading3"/>
       </w:pPr>
-      <w:r>
-        <w:t>Activity Bar.</w:t>
+      <w:proofErr w:type="spellStart"/>
+      <w:r>
+        <w:t>Activity</w:t>
+      </w:r>
+      <w:proofErr w:type="spellEnd"/>
+      <w:r>
+        <w:t xml:space="preserve"> Bar.</w:t>
       </w:r>
     </w:p>
     <w:p>
@@ -882,23 +2599,40 @@
       <w:pPr>
         <w:pStyle w:val="Heading2"/>
       </w:pPr>
-      <w:r>
-        <w:t>Debug.</w:t>
-      </w:r>
-    </w:p>
-    <w:p>
-      <w:r>
-        <w:t xml:space="preserve">Vysvetliť jednoduchý príklad ľadenia cez debug pre </w:t>
-      </w:r>
-      <w:r>
-        <w:t>programovac</w:t>
-      </w:r>
-      <w:r>
-        <w:t>í</w:t>
-      </w:r>
-      <w:r>
-        <w:t xml:space="preserve"> jazyk Python</w:t>
-      </w:r>
+      <w:proofErr w:type="spellStart"/>
+      <w:r>
+        <w:t>Debug</w:t>
+      </w:r>
+      <w:proofErr w:type="spellEnd"/>
+      <w:r>
+        <w:t>.</w:t>
+      </w:r>
+    </w:p>
+    <w:p>
+      <w:r>
+        <w:t xml:space="preserve">Vysvetliť jednoduchý príklad </w:t>
+      </w:r>
+      <w:proofErr w:type="spellStart"/>
+      <w:r>
+        <w:t>ľadenia</w:t>
+      </w:r>
+      <w:proofErr w:type="spellEnd"/>
+      <w:r>
+        <w:t xml:space="preserve"> cez </w:t>
+      </w:r>
+      <w:proofErr w:type="spellStart"/>
+      <w:r>
+        <w:t>debug</w:t>
+      </w:r>
+      <w:proofErr w:type="spellEnd"/>
+      <w:r>
+        <w:t xml:space="preserve"> pre programovací jazyk </w:t>
+      </w:r>
+      <w:proofErr w:type="spellStart"/>
+      <w:r>
+        <w:t>Python</w:t>
+      </w:r>
+      <w:proofErr w:type="spellEnd"/>
       <w:r>
         <w:t xml:space="preserve"> – príklad </w:t>
       </w:r>
@@ -920,16 +2654,53 @@
     </w:p>
     <w:p>
       <w:r>
-        <w:t>Vytvoril som zložku Tutorial</w:t>
-      </w:r>
-      <w:r>
-        <w:t xml:space="preserve">VSC, </w:t>
-      </w:r>
-      <w:r>
-        <w:t xml:space="preserve">Kde sa pokúsim vytvoriť a postupne zapísať všetky info ukážkové informácie z dokumentácie pre Visual </w:t>
-      </w:r>
-      <w:r>
-        <w:t>Studio Code.</w:t>
+        <w:t xml:space="preserve">Vytvoril som zložku </w:t>
+      </w:r>
+      <w:proofErr w:type="spellStart"/>
+      <w:r>
+        <w:t>Tutorial</w:t>
+      </w:r>
+      <w:r>
+        <w:t>VSC</w:t>
+      </w:r>
+      <w:proofErr w:type="spellEnd"/>
+      <w:r>
+        <w:t xml:space="preserve">, </w:t>
+      </w:r>
+      <w:r>
+        <w:t xml:space="preserve">Kde sa pokúsim vytvoriť a postupne zapísať všetky </w:t>
+      </w:r>
+      <w:proofErr w:type="spellStart"/>
+      <w:r>
+        <w:t>info</w:t>
+      </w:r>
+      <w:proofErr w:type="spellEnd"/>
+      <w:r>
+        <w:t xml:space="preserve"> ukážkové informácie z dokumentácie pre </w:t>
+      </w:r>
+      <w:proofErr w:type="spellStart"/>
+      <w:r>
+        <w:t>Visual</w:t>
+      </w:r>
+      <w:proofErr w:type="spellEnd"/>
+      <w:r>
+        <w:t xml:space="preserve"> </w:t>
+      </w:r>
+      <w:proofErr w:type="spellStart"/>
+      <w:r>
+        <w:t>Studio</w:t>
+      </w:r>
+      <w:proofErr w:type="spellEnd"/>
+      <w:r>
+        <w:t xml:space="preserve"> </w:t>
+      </w:r>
+      <w:proofErr w:type="spellStart"/>
+      <w:r>
+        <w:t>Code</w:t>
+      </w:r>
+      <w:proofErr w:type="spellEnd"/>
+      <w:r>
+        <w:t>.</w:t>
       </w:r>
     </w:p>
     <w:p>
@@ -943,6 +2714,9 @@
     </w:p>
     <w:p>
       <w:r>
+        <w:rPr>
+          <w:noProof/>
+        </w:rPr>
         <w:drawing>
           <wp:inline distT="0" distB="0" distL="0" distR="0" wp14:anchorId="536E4F92" wp14:editId="49EF70E0">
             <wp:extent cx="3238585" cy="1083157"/>
@@ -986,10 +2760,7 @@
         <w:pStyle w:val="Heading3"/>
       </w:pPr>
       <w:r>
-        <w:t xml:space="preserve">Paralelné </w:t>
-      </w:r>
-      <w:r>
-        <w:t>editory</w:t>
+        <w:t>Paralelné editory</w:t>
       </w:r>
     </w:p>
     <w:p>
@@ -1004,7 +2775,7 @@
       </w:r>
     </w:p>
     <w:p>
-      <w:hyperlink r:id="rId12" w:history="1">
+      <w:hyperlink r:id="rId12" w:anchor="_side-by-side-editing" w:history="1">
         <w:r>
           <w:rPr>
             <w:rStyle w:val="Hyperlink"/>
@@ -1026,7 +2797,23 @@
         <w:t xml:space="preserve">Zapísať - </w:t>
       </w:r>
       <w:r>
-        <w:t>echo "Hello, VS Code" &gt; greetings.txt</w:t>
+        <w:t>echo "</w:t>
+      </w:r>
+      <w:proofErr w:type="spellStart"/>
+      <w:r>
+        <w:t>Hello</w:t>
+      </w:r>
+      <w:proofErr w:type="spellEnd"/>
+      <w:r>
+        <w:t xml:space="preserve">, VS </w:t>
+      </w:r>
+      <w:proofErr w:type="spellStart"/>
+      <w:r>
+        <w:t>Code</w:t>
+      </w:r>
+      <w:proofErr w:type="spellEnd"/>
+      <w:r>
+        <w:t>" &gt; greetings.txt</w:t>
       </w:r>
     </w:p>
     <w:p>
@@ -1038,7 +2825,7 @@
       </w:r>
     </w:p>
     <w:p>
-      <w:hyperlink r:id="rId13" w:history="1">
+      <w:hyperlink r:id="rId13" w:anchor="_build-an-app-with-an-ai-agent" w:history="1">
         <w:r>
           <w:rPr>
             <w:rStyle w:val="Hyperlink"/>
@@ -1050,6 +2837,25 @@
         <w:t xml:space="preserve"> </w:t>
       </w:r>
     </w:p>
+    <w:p>
+      <w:r>
+        <w:t xml:space="preserve">Agent </w:t>
+      </w:r>
+      <w:proofErr w:type="spellStart"/>
+      <w:r>
+        <w:t>Window</w:t>
+      </w:r>
+      <w:proofErr w:type="spellEnd"/>
+      <w:r>
+        <w:t xml:space="preserve"> – </w:t>
+      </w:r>
+      <w:proofErr w:type="spellStart"/>
+      <w:r>
+        <w:t>Ctrl+Shift+a</w:t>
+      </w:r>
+      <w:proofErr w:type="spellEnd"/>
+    </w:p>
+    <w:p/>
     <w:sectPr>
       <w:footerReference w:type="default" r:id="rId14"/>
       <w:pgSz w:w="12240" w:h="15840"/>
@@ -2564,6 +4370,7 @@
   <w:style w:type="character" w:default="1" w:styleId="DefaultParagraphFont">
     <w:name w:val="Default Paragraph Font"/>
     <w:uiPriority w:val="1"/>
+    <w:semiHidden/>
     <w:unhideWhenUsed/>
   </w:style>
   <w:style w:type="table" w:default="1" w:styleId="TableNormal">

</xml_diff>

<commit_message>
Add HTML attributes resource link in poznamky_k_hodinam.docx
</commit_message>
<xml_diff>
--- a/Poznamky/poznamky_k_hodinam.docx
+++ b/Poznamky/poznamky_k_hodinam.docx
@@ -76,21 +76,7 @@
         <w:rPr>
           <w:lang w:val="en-US"/>
         </w:rPr>
-        <w:t xml:space="preserve"> </w:t>
-      </w:r>
-      <w:proofErr w:type="spellStart"/>
-      <w:r>
-        <w:rPr>
-          <w:lang w:val="en-US"/>
-        </w:rPr>
-        <w:t>na</w:t>
-      </w:r>
-      <w:proofErr w:type="spellEnd"/>
-      <w:r>
-        <w:rPr>
-          <w:lang w:val="en-US"/>
-        </w:rPr>
-        <w:t xml:space="preserve"> </w:t>
+        <w:t xml:space="preserve"> na </w:t>
       </w:r>
       <w:proofErr w:type="spellStart"/>
       <w:r>
@@ -2855,9 +2841,56 @@
       </w:r>
       <w:proofErr w:type="spellEnd"/>
     </w:p>
+    <w:p>
+      <w:pPr>
+        <w:pBdr>
+          <w:bottom w:val="double" w:sz="6" w:space="1" w:color="auto"/>
+        </w:pBdr>
+      </w:pPr>
+    </w:p>
+    <w:p>
+      <w:r>
+        <w:t>2.10.2026</w:t>
+      </w:r>
+    </w:p>
+    <w:p>
+      <w:hyperlink r:id="rId14" w:history="1">
+        <w:r>
+          <w:rPr>
+            <w:rStyle w:val="Hyperlink"/>
+          </w:rPr>
+          <w:t xml:space="preserve">HTML </w:t>
+        </w:r>
+        <w:proofErr w:type="spellStart"/>
+        <w:r>
+          <w:rPr>
+            <w:rStyle w:val="Hyperlink"/>
+          </w:rPr>
+          <w:t>Attributes</w:t>
+        </w:r>
+        <w:proofErr w:type="spellEnd"/>
+        <w:r>
+          <w:rPr>
+            <w:rStyle w:val="Hyperlink"/>
+          </w:rPr>
+          <w:t xml:space="preserve"> - </w:t>
+        </w:r>
+        <w:proofErr w:type="spellStart"/>
+        <w:r>
+          <w:rPr>
+            <w:rStyle w:val="Hyperlink"/>
+          </w:rPr>
+          <w:t>GeeksforGeeks</w:t>
+        </w:r>
+        <w:proofErr w:type="spellEnd"/>
+      </w:hyperlink>
+      <w:r>
+        <w:t xml:space="preserve"> – veľmi dobré ukážky rôznych atribútov</w:t>
+      </w:r>
+    </w:p>
     <w:p/>
     <w:sectPr>
-      <w:footerReference w:type="default" r:id="rId14"/>
+      <w:footerReference w:type="default" r:id="rId15"/>
       <w:pgSz w:w="12240" w:h="15840"/>
       <w:pgMar w:top="1440" w:right="1440" w:bottom="1440" w:left="1440" w:header="708" w:footer="708" w:gutter="0"/>
       <w:cols w:space="708"/>
@@ -4370,7 +4403,6 @@
   <w:style w:type="character" w:default="1" w:styleId="DefaultParagraphFont">
     <w:name w:val="Default Paragraph Font"/>
     <w:uiPriority w:val="1"/>
-    <w:semiHidden/>
     <w:unhideWhenUsed/>
   </w:style>
   <w:style w:type="table" w:default="1" w:styleId="TableNormal">

</xml_diff>